<commit_message>
Deep polish performance SEO assets and ATS resume
</commit_message>
<xml_diff>
--- a/assets/resume/Manashjyoti_Bora_Resume.docx
+++ b/assets/resume/Manashjyoti_Bora_Resume.docx
@@ -4,10 +4,13 @@
   <w:body>
     <w:p>
       <w:pPr>
-        <w:pStyle w:val="Title"/>
         <w:jc w:val="center"/>
       </w:pPr>
       <w:r>
+        <w:rPr>
+          <w:b/>
+          <w:sz w:val="32"/>
+        </w:rPr>
         <w:t>Manashjyoti Bora</w:t>
       </w:r>
     </w:p>
@@ -32,12 +35,23 @@
         <w:pStyle w:val="Heading2"/>
       </w:pPr>
       <w:r>
-        <w:t>Professional Summary</w:t>
+        <w:t>PROFESSIONAL SUMMARY</w:t>
       </w:r>
     </w:p>
     <w:p>
+      <w:pPr>
+        <w:pStyle w:val="ListBullet"/>
+      </w:pPr>
       <w:r>
-        <w:t>Creative Developer and Learner and B.Voc IT First Year student at Dr. Birinchi Kumar Barooah College (Dr. B.K.B. College). Currently pursuing B.Voc IT. Passionate about building clean, responsive, and user-friendly web experiences while growing skills in modern web development. Focused on frontend development, UI implementation, and learning full-stack patterns through real GitHub projects. Based in Nagaon, Assam, open to internships and collaborative learning.</w:t>
+        <w:t>Creative Developer and Learner and B.Voc IT First Year Student at Dr. Birinchi Kumar Barooah College (Dr. B.K.B. College). Currently pursuing B.Voc IT and building clean, responsive, user-friendly web experiences.</w:t>
+      </w:r>
+    </w:p>
+    <w:p>
+      <w:pPr>
+        <w:pStyle w:val="ListBullet"/>
+      </w:pPr>
+      <w:r>
+        <w:t>Focused on frontend development, UI implementation, and learning full-stack patterns through real GitHub projects. Open to internships and collaborative learning opportunities.</w:t>
       </w:r>
     </w:p>
     <w:p>
@@ -45,16 +59,31 @@
         <w:pStyle w:val="Heading2"/>
       </w:pPr>
       <w:r>
-        <w:t>Education</w:t>
+        <w:t>EDUCATION</w:t>
       </w:r>
     </w:p>
     <w:p>
+      <w:pPr>
+        <w:pStyle w:val="ListBullet"/>
+      </w:pPr>
       <w:r>
         <w:t>B.Voc in Information Technology - First Year Student | Currently Pursuing</w:t>
-        <w:br/>
+      </w:r>
+    </w:p>
+    <w:p>
+      <w:pPr>
+        <w:pStyle w:val="ListBullet"/>
+      </w:pPr>
+      <w:r>
         <w:t>Dr. Birinchi Kumar Barooah College (Dr. B.K.B. College), Assam, India</w:t>
-        <w:br/>
-        <w:t>Currently pursuing B.Voc IT with focus on fundamentals of IT, web development, programming basics, and practical project building. Learning IT fundamentals, web development, and practical project building.</w:t>
+      </w:r>
+    </w:p>
+    <w:p>
+      <w:pPr>
+        <w:pStyle w:val="ListBullet"/>
+      </w:pPr>
+      <w:r>
+        <w:t>Learning IT fundamentals, web development, programming basics, and practical project building.</w:t>
       </w:r>
     </w:p>
     <w:p>
@@ -62,18 +91,31 @@
         <w:pStyle w:val="Heading2"/>
       </w:pPr>
       <w:r>
-        <w:t>Skills</w:t>
+        <w:t>SKILLS</w:t>
       </w:r>
     </w:p>
     <w:p>
+      <w:pPr>
+        <w:pStyle w:val="ListBullet"/>
+      </w:pPr>
       <w:r>
-        <w:t>Frontend Development: HTML5, CSS3, JavaScript (ES6+), React.js, Next.js (learning), Responsive Design, UI Implementation, Bootstrap, Tailwind CSS basics</w:t>
-        <w:br/>
-        <w:t>Programming Basics: JavaScript, TypeScript (basic), Git, REST API basics, Zod validation basics</w:t>
-        <w:br/>
-        <w:t>Tools and Platforms: Git and GitHub, Vite, npm, VS Code, MongoDB Atlas (basic), Netlify and Vercel deployment</w:t>
-        <w:br/>
-        <w:t>Learning Areas: Next.js App Router, JWT Auth, State Management, Cart and Checkout, Role-based access, Client-side filtering</w:t>
+        <w:t>Frontend: HTML5, CSS3, JavaScript ES6+, React.js, Next.js learning, Responsive Design, UI Implementation, Bootstrap, Tailwind CSS basics.</w:t>
+      </w:r>
+    </w:p>
+    <w:p>
+      <w:pPr>
+        <w:pStyle w:val="ListBullet"/>
+      </w:pPr>
+      <w:r>
+        <w:t>Programming and Tools: JavaScript, TypeScript basics, Git, GitHub, Vite, npm, VS Code, Chrome DevTools.</w:t>
+      </w:r>
+    </w:p>
+    <w:p>
+      <w:pPr>
+        <w:pStyle w:val="ListBullet"/>
+      </w:pPr>
+      <w:r>
+        <w:t>Learning Areas: REST API basics, Zod validation basics, MongoDB Atlas basics, JWT authentication concepts, State Management, CRUD patterns.</w:t>
       </w:r>
     </w:p>
     <w:p>
@@ -81,55 +123,107 @@
         <w:pStyle w:val="Heading2"/>
       </w:pPr>
       <w:r>
-        <w:t>Projects</w:t>
+        <w:t>PROJECTS</w:t>
       </w:r>
     </w:p>
     <w:p>
       <w:r>
-        <w:t>NexusMart - Full-Stack E-commerce Platform (Next.js, TypeScript, MongoDB, JWT) - github.com/Manashjyoti-Bora/nexusmart - Live: nexusmart-dusky.vercel.app</w:t>
-        <w:br/>
-        <w:t>- Built full-stack e-commerce using Next.js App Router, TypeScript, MongoDB Atlas</w:t>
-        <w:br/>
-        <w:t>- Implemented JWT auth with bcrypt and HTTP-only cookies, cart and checkout logic</w:t>
-        <w:br/>
-        <w:t>- Created role-gated admin panel, Zod validation on every mutation</w:t>
-        <w:br/>
-        <w:t>- Applied CI with typecheck, lint and build pipeline</w:t>
+        <w:rPr>
+          <w:b/>
+        </w:rPr>
+        <w:t>NexusMart - Full-Stack E-commerce Platform</w:t>
       </w:r>
     </w:p>
     <w:p>
       <w:r>
-        <w:t>DevHire Pro ATS - Job Portal and Applicant Tracking UI (React 19, Vite) - github.com/Manashjyoti-Bora/devhire-pro-ats</w:t>
-        <w:br/>
-        <w:t>- Designed job portal UI with real-time multi-attribute filtering (role, stack, salary, location)</w:t>
-        <w:br/>
-        <w:t>- Implemented glassmorphic light and dark themes using CSS variables end to end</w:t>
-        <w:br/>
-        <w:t>- Built application pipeline tracker: Applied to Screening to Interview to Assessment to Offer</w:t>
-        <w:br/>
-        <w:t>- Demonstrated complex UI state design and progressive disclosure patterns as a learning project</w:t>
+        <w:t>Tech: Next.js, TypeScript, MongoDB, JWT | GitHub: github.com/Manashjyoti-Bora/nexusmart | Live: nexusmart-dusky.vercel.app</w:t>
+      </w:r>
+    </w:p>
+    <w:p>
+      <w:pPr>
+        <w:pStyle w:val="ListBullet"/>
+      </w:pPr>
+      <w:r>
+        <w:t>Built full-stack e-commerce using Next.js App Router, TypeScript, and MongoDB Atlas.</w:t>
+      </w:r>
+    </w:p>
+    <w:p>
+      <w:pPr>
+        <w:pStyle w:val="ListBullet"/>
+      </w:pPr>
+      <w:r>
+        <w:t>Implemented JWT authentication concepts, cart and checkout flow, admin panel, and Zod validation patterns.</w:t>
       </w:r>
     </w:p>
     <w:p>
       <w:r>
-        <w:t>TaskFlow Enterprise - Kanban Productivity App (React, State Management) - github.com/Manashjyoti-Bora/taskflow-enterprise</w:t>
-        <w:br/>
-        <w:t>- Created Kanban productivity app with dynamic boards, live priority tagging and sprint tracking</w:t>
-        <w:br/>
-        <w:t>- Used React with modern state management, component-per-column architecture</w:t>
-        <w:br/>
-        <w:t>- Implemented CRUD with optimistic UI updates, memoized lists and keyed renders</w:t>
+        <w:rPr>
+          <w:b/>
+        </w:rPr>
+        <w:t>DevHire Pro ATS - Job Portal and Applicant Tracking UI</w:t>
       </w:r>
     </w:p>
     <w:p>
       <w:r>
-        <w:t>Personal Portfolio - This Website (HTML, CSS, JS, GSAP, AOS) - github.com/Manashjyoti-Bora/portfolio - Live: manashbora.vercel.app</w:t>
-        <w:br/>
-        <w:t>- Designed and developed premium responsive personal portfolio with 100 percent personal data</w:t>
-        <w:br/>
-        <w:t>- Implemented animations with GSAP and AOS, custom cursor, offcanvas menu, and SEO optimization</w:t>
-        <w:br/>
-        <w:t>- Showcases real projects, education, skills, and ATS resume</w:t>
+        <w:t>Tech: React 19, Vite, UI Design | GitHub: github.com/Manashjyoti-Bora/devhire-pro-ats</w:t>
+      </w:r>
+    </w:p>
+    <w:p>
+      <w:pPr>
+        <w:pStyle w:val="ListBullet"/>
+      </w:pPr>
+      <w:r>
+        <w:t>Designed job portal UI with multi-attribute filtering, glassmorphic themes, and an application pipeline tracker.</w:t>
+      </w:r>
+    </w:p>
+    <w:p>
+      <w:pPr>
+        <w:pStyle w:val="ListBullet"/>
+      </w:pPr>
+      <w:r>
+        <w:t>Practiced complex UI state design and progressive disclosure patterns.</w:t>
+      </w:r>
+    </w:p>
+    <w:p>
+      <w:r>
+        <w:rPr>
+          <w:b/>
+        </w:rPr>
+        <w:t>TaskFlow Enterprise - Kanban Productivity App</w:t>
+      </w:r>
+    </w:p>
+    <w:p>
+      <w:r>
+        <w:t>Tech: React, Kanban, CRUD | GitHub: github.com/Manashjyoti-Bora/taskflow-enterprise</w:t>
+      </w:r>
+    </w:p>
+    <w:p>
+      <w:pPr>
+        <w:pStyle w:val="ListBullet"/>
+      </w:pPr>
+      <w:r>
+        <w:t>Created Kanban productivity app with boards, priority tags, sprint tracking, CRUD patterns, and optimized list rendering.</w:t>
+      </w:r>
+    </w:p>
+    <w:p>
+      <w:r>
+        <w:rPr>
+          <w:b/>
+        </w:rPr>
+        <w:t>Personal Portfolio - This Website</w:t>
+      </w:r>
+    </w:p>
+    <w:p>
+      <w:r>
+        <w:t>Tech: HTML, CSS, JavaScript, GSAP, AOS, SEO | GitHub: github.com/Manashjyoti-Bora/portfolio | Live: manashbora.vercel.app</w:t>
+      </w:r>
+    </w:p>
+    <w:p>
+      <w:pPr>
+        <w:pStyle w:val="ListBullet"/>
+      </w:pPr>
+      <w:r>
+        <w:t>Built responsive portfolio showcasing projects, education, skills, contact form, animations, SEO, and ATS resume.</w:t>
       </w:r>
     </w:p>
     <w:p>
@@ -137,12 +231,23 @@
         <w:pStyle w:val="Heading2"/>
       </w:pPr>
       <w:r>
-        <w:t>Additional Information</w:t>
+        <w:t>ADDITIONAL INFORMATION</w:t>
       </w:r>
     </w:p>
     <w:p>
+      <w:pPr>
+        <w:pStyle w:val="ListBullet"/>
+      </w:pPr>
       <w:r>
-        <w:t>Open to Work and Internships, based in Nagaon, Assam, India. 12 followers on GitHub, 52 contributions last year. Learning, building, growing through modern web development. 2+ Years of Experience - Learning and Building, Project-Based Practice, Creative Development Journey. Languages: English, Assamese, Hindi.</w:t>
+        <w:t>Open to Work and Internships. Languages: English, Assamese, Hindi.</w:t>
+      </w:r>
+    </w:p>
+    <w:p>
+      <w:pPr>
+        <w:pStyle w:val="ListBullet"/>
+      </w:pPr>
+      <w:r>
+        <w:t>Learning, building, and growing through modern web development. 2+ Years of Experience in learning and project-based practice.</w:t>
       </w:r>
     </w:p>
     <w:sectPr>
@@ -519,8 +624,8 @@
     <w:qFormat/>
     <w:rsid w:val="00FC693F"/>
     <w:rPr>
-      <w:rFonts w:ascii="Calibri" w:hAnsi="Calibri"/>
-      <w:sz w:val="22"/>
+      <w:rFonts w:ascii="Arial" w:hAnsi="Arial"/>
+      <w:sz w:val="20"/>
     </w:rPr>
   </w:style>
   <w:style w:type="paragraph" w:styleId="Header">

</xml_diff>